<commit_message>
Changes to the cv
</commit_message>
<xml_diff>
--- a/assets/kitsaras_cv.docx
+++ b/assets/kitsaras_cv.docx
@@ -569,7 +569,13 @@
         </w:numPr>
       </w:pPr>
       <w:r>
-        <w:t>2019–2023 | Ph.D. in Chemistry, Johannes-Gutenberg University of Mainz, Germany (summa cum laude)</w:t>
+        <w:t xml:space="preserve">2019–2023 | Ph.D. in Chemistry, </w:t>
+      </w:r>
+      <w:r>
+        <w:t>Johannes Gutenberg University Mainz</w:t>
+      </w:r>
+      <w:r>
+        <w:t>, Germany (summa cum laude)</w:t>
       </w:r>
     </w:p>
     <w:p>
@@ -621,7 +627,31 @@
       </w:r>
       <w:proofErr w:type="gramEnd"/>
       <w:r>
-        <w:t xml:space="preserve"> on mathematics for theoretical chemistry and physics (Machine Learning), GDR NBODY, Paris, France</w:t>
+        <w:t xml:space="preserve"> on </w:t>
+      </w:r>
+      <w:r>
+        <w:t>M</w:t>
+      </w:r>
+      <w:r>
+        <w:t xml:space="preserve">athematics for </w:t>
+      </w:r>
+      <w:r>
+        <w:t>T</w:t>
+      </w:r>
+      <w:r>
+        <w:t xml:space="preserve">heoretical </w:t>
+      </w:r>
+      <w:r>
+        <w:t>C</w:t>
+      </w:r>
+      <w:r>
+        <w:t xml:space="preserve">hemistry and </w:t>
+      </w:r>
+      <w:r>
+        <w:t>P</w:t>
+      </w:r>
+      <w:r>
+        <w:t>hysics (Machine Learning), GDR NBODY, Paris, France</w:t>
       </w:r>
     </w:p>
     <w:p>
@@ -633,7 +663,31 @@
         </w:numPr>
       </w:pPr>
       <w:r>
-        <w:t>2021 | Molecular response properties summer school (MRPSS 2021), Stockholm, Sweden</w:t>
+        <w:t xml:space="preserve">2021 | Molecular </w:t>
+      </w:r>
+      <w:r>
+        <w:t>R</w:t>
+      </w:r>
+      <w:r>
+        <w:t xml:space="preserve">esponse </w:t>
+      </w:r>
+      <w:r>
+        <w:t>P</w:t>
+      </w:r>
+      <w:r>
+        <w:t xml:space="preserve">roperties </w:t>
+      </w:r>
+      <w:r>
+        <w:t>S</w:t>
+      </w:r>
+      <w:r>
+        <w:t xml:space="preserve">ummer </w:t>
+      </w:r>
+      <w:r>
+        <w:t>S</w:t>
+      </w:r>
+      <w:r>
+        <w:t>chool (MRPSS 2021), Stockholm, Sweden</w:t>
       </w:r>
     </w:p>
     <w:p>
@@ -645,14 +699,47 @@
         </w:numPr>
       </w:pPr>
       <w:r>
-        <w:t>2019 | European summer school in quantum chemistry (ESQC 2019), Sicely, Italy</w:t>
+        <w:t xml:space="preserve">2019 | European </w:t>
+      </w:r>
+      <w:r>
+        <w:t>S</w:t>
+      </w:r>
+      <w:r>
+        <w:t xml:space="preserve">ummer </w:t>
+      </w:r>
+      <w:r>
+        <w:t>S</w:t>
+      </w:r>
+      <w:r>
+        <w:t xml:space="preserve">chool in </w:t>
+      </w:r>
+      <w:r>
+        <w:t>Q</w:t>
+      </w:r>
+      <w:r>
+        <w:t xml:space="preserve">uantum </w:t>
+      </w:r>
+      <w:r>
+        <w:t>C</w:t>
+      </w:r>
+      <w:r>
+        <w:t>hemistry (ESQC 2019), Sic</w:t>
+      </w:r>
+      <w:r>
+        <w:t>i</w:t>
+      </w:r>
+      <w:r>
+        <w:t>ly, Italy</w:t>
       </w:r>
     </w:p>
+    <w:p/>
+    <w:p/>
     <w:p>
       <w:pPr>
         <w:pStyle w:val="Heading1"/>
       </w:pPr>
       <w:r>
+        <w:lastRenderedPageBreak/>
         <w:t>Professional and Academic Experience</w:t>
       </w:r>
     </w:p>
@@ -665,7 +752,16 @@
         </w:numPr>
       </w:pPr>
       <w:r>
-        <w:t>2024–present | Postdoctoral researcher in the group of Dr. Pierre-François Loos</w:t>
+        <w:t xml:space="preserve">2024–present | Postdoctoral researcher </w:t>
+      </w:r>
+      <w:r>
+        <w:br/>
+      </w:r>
+      <w:r>
+        <w:t>G</w:t>
+      </w:r>
+      <w:r>
+        <w:t>roup of Dr. Pierre-François Loos</w:t>
       </w:r>
       <w:r>
         <w:br/>
@@ -681,7 +777,14 @@
         </w:numPr>
       </w:pPr>
       <w:r>
-        <w:t xml:space="preserve">2023–2024 | Postdoctoral researcher in the group of Prof. Dr. Stella </w:t>
+        <w:t xml:space="preserve">2023–2024 | Postdoctoral researcher </w:t>
+      </w:r>
+      <w:r>
+        <w:br/>
+        <w:t>G</w:t>
+      </w:r>
+      <w:r>
+        <w:t xml:space="preserve">roup of Prof. Dr. Stella </w:t>
       </w:r>
       <w:proofErr w:type="spellStart"/>
       <w:r>
@@ -690,7 +793,13 @@
       <w:proofErr w:type="spellEnd"/>
       <w:r>
         <w:br/>
-        <w:t>Saarland University, Saarbrucken, Germany</w:t>
+        <w:t xml:space="preserve">Saarland University, </w:t>
+      </w:r>
+      <w:r>
+        <w:t>Saarbrücken</w:t>
+      </w:r>
+      <w:r>
+        <w:t>, Germany</w:t>
       </w:r>
     </w:p>
     <w:p>
@@ -702,19 +811,51 @@
         </w:numPr>
       </w:pPr>
       <w:r>
-        <w:lastRenderedPageBreak/>
-        <w:t xml:space="preserve">2019–2023 | Scientific staff member in the Theoretical Chemistry group </w:t>
+        <w:t xml:space="preserve">2019–2023 </w:t>
+      </w:r>
+      <w:r>
+        <w:t xml:space="preserve">| </w:t>
+      </w:r>
+      <w:r>
+        <w:t xml:space="preserve">PhD </w:t>
+      </w:r>
+      <w:r>
+        <w:t>r</w:t>
+      </w:r>
+      <w:r>
+        <w:t>esearcher</w:t>
+      </w:r>
+      <w:r>
+        <w:t xml:space="preserve"> </w:t>
       </w:r>
       <w:r>
         <w:br/>
-        <w:t>(PhD student supervised by Prof. Dr. Jürgen Gauss and Prof. Dr. Stella Stopkowicz)</w:t>
-      </w:r>
+        <w:t>S</w:t>
+      </w:r>
+      <w:r>
+        <w:t xml:space="preserve">upervisors: Prof. Dr. Jürgen Gauss and Prof. Dr. Stella </w:t>
+      </w:r>
+      <w:proofErr w:type="spellStart"/>
+      <w:r>
+        <w:t>Stopkowicz</w:t>
+      </w:r>
+      <w:proofErr w:type="spellEnd"/>
       <w:r>
         <w:br/>
-        <w:t>Johannes-Gutenberg University Mainz, Mainz, Germany</w:t>
+      </w:r>
+      <w:r>
+        <w:rPr>
+          <w:lang w:val="en-GB"/>
+        </w:rPr>
+        <w:t>Johannes Gutenberg</w:t>
+      </w:r>
+      <w:r>
+        <w:rPr>
+          <w:lang w:val="en-GB"/>
+        </w:rPr>
+        <w:t xml:space="preserve"> University Mainz, Mainz, Germany</w:t>
       </w:r>
     </w:p>
-    <w:p/>
     <w:p>
       <w:pPr>
         <w:pStyle w:val="Heading1"/>
@@ -738,19 +879,34 @@
         <w:t>6</w:t>
       </w:r>
       <w:r>
-        <w:t xml:space="preserve"> | Tutor in the European Summer school in Quantum Chemistry (ESQC 202</w:t>
+        <w:t xml:space="preserve"> | Tutor </w:t>
+      </w:r>
+      <w:r>
+        <w:t>at</w:t>
+      </w:r>
+      <w:r>
+        <w:t xml:space="preserve"> the European Summer </w:t>
+      </w:r>
+      <w:r>
+        <w:t>S</w:t>
+      </w:r>
+      <w:r>
+        <w:t>chool in Quantum Chemistry (ESQC 202</w:t>
       </w:r>
       <w:r>
         <w:t>6</w:t>
       </w:r>
       <w:r>
-        <w:t>), Sicely, Italy</w:t>
-      </w:r>
-      <w:r>
-        <w:t xml:space="preserve"> </w:t>
-      </w:r>
-      <w:r>
-        <w:t>(Upcoming)</w:t>
+        <w:t xml:space="preserve">), </w:t>
+      </w:r>
+      <w:r>
+        <w:t>Sicily</w:t>
+      </w:r>
+      <w:r>
+        <w:t>, Italy</w:t>
+      </w:r>
+      <w:r>
+        <w:t xml:space="preserve"> (Upcoming)</w:t>
       </w:r>
     </w:p>
     <w:p>
@@ -762,7 +918,13 @@
         </w:numPr>
       </w:pPr>
       <w:r>
-        <w:t>2025 | Tutor in the Modern Wavefunction Based Methods in Electronic Structure Theory Summer School (MWM 2025), Pisa, Italy</w:t>
+        <w:t xml:space="preserve">2025 | Tutor </w:t>
+      </w:r>
+      <w:r>
+        <w:t>at</w:t>
+      </w:r>
+      <w:r>
+        <w:t xml:space="preserve"> the Modern Wavefunction Based Methods in Electronic Structure Theory Summer School (MWM 2025), Pisa, Italy</w:t>
       </w:r>
     </w:p>
     <w:p>
@@ -774,7 +936,25 @@
         </w:numPr>
       </w:pPr>
       <w:r>
-        <w:t>2024 | Tutor in the European Summer school in Quantum Chemistry (ESQC 2024), Sicely, Italy</w:t>
+        <w:t xml:space="preserve">2024 | Tutor </w:t>
+      </w:r>
+      <w:r>
+        <w:t>at</w:t>
+      </w:r>
+      <w:r>
+        <w:t xml:space="preserve"> the European Summer </w:t>
+      </w:r>
+      <w:r>
+        <w:t>S</w:t>
+      </w:r>
+      <w:r>
+        <w:t xml:space="preserve">chool in Quantum Chemistry (ESQC 2024), </w:t>
+      </w:r>
+      <w:r>
+        <w:t>Sicily</w:t>
+      </w:r>
+      <w:r>
+        <w:t>, Italy</w:t>
       </w:r>
     </w:p>
     <w:p>
@@ -786,7 +966,16 @@
         </w:numPr>
       </w:pPr>
       <w:r>
-        <w:t>2023 | Tutor in the Modern Wavefunction Based Methods in Electronic Structure Theory Summer School (MWM 2023), Pisa, Italy</w:t>
+        <w:t xml:space="preserve">2023 | Tutor </w:t>
+      </w:r>
+      <w:r>
+        <w:t>at</w:t>
+      </w:r>
+      <w:r>
+        <w:t xml:space="preserve"> the Modern Wavefunction Based Methods in Electronic Structure Theory </w:t>
+      </w:r>
+      <w:r>
+        <w:t>Summer School (MWM 2023), Pisa, Italy</w:t>
       </w:r>
     </w:p>
     <w:p>
@@ -802,7 +991,13 @@
       </w:r>
       <w:r>
         <w:br/>
-        <w:t>Saarland University, Saarbrucken, Germany</w:t>
+        <w:t xml:space="preserve">Saarland University, </w:t>
+      </w:r>
+      <w:r>
+        <w:t>Saarbrücken</w:t>
+      </w:r>
+      <w:r>
+        <w:t>, Germany</w:t>
       </w:r>
     </w:p>
     <w:p>
@@ -814,25 +1009,17 @@
         </w:numPr>
       </w:pPr>
       <w:r>
-        <w:t xml:space="preserve">2023-present | </w:t>
-      </w:r>
-      <w:r>
-        <w:t>Co-supervision of Bachelor Theses</w:t>
-      </w:r>
-      <w:r>
-        <w:t>, Master Theses</w:t>
-      </w:r>
-      <w:r>
-        <w:t xml:space="preserve"> and research projects</w:t>
-      </w:r>
-      <w:r>
-        <w:t xml:space="preserve"> </w:t>
+        <w:t xml:space="preserve">2023-present | Co-supervision of Bachelor Theses, Master Theses and research projects </w:t>
       </w:r>
       <w:r>
         <w:br/>
-      </w:r>
-      <w:r>
-        <w:t>Saarland University, Saarbrucken, Germany</w:t>
+        <w:t xml:space="preserve">Saarland University, </w:t>
+      </w:r>
+      <w:r>
+        <w:t>Saarbrücken</w:t>
+      </w:r>
+      <w:r>
+        <w:t>, Germany</w:t>
       </w:r>
     </w:p>
     <w:p>
@@ -842,49 +1029,25 @@
           <w:ilvl w:val="1"/>
           <w:numId w:val="10"/>
         </w:numPr>
-        <w:rPr>
-          <w:lang w:val="de-DE"/>
-        </w:rPr>
-      </w:pPr>
-      <w:r>
-        <w:rPr>
-          <w:lang w:val="de-DE"/>
-        </w:rPr>
-        <w:t>“Benchmark für adiabatische Ionisierungspotentiale”, 202</w:t>
-      </w:r>
-      <w:r>
-        <w:rPr>
-          <w:lang w:val="de-DE"/>
-        </w:rPr>
-        <w:t>6</w:t>
-      </w:r>
-      <w:r>
-        <w:rPr>
-          <w:lang w:val="de-DE"/>
-        </w:rPr>
-        <w:t xml:space="preserve"> (</w:t>
-      </w:r>
-      <w:proofErr w:type="gramStart"/>
-      <w:r>
-        <w:rPr>
-          <w:lang w:val="de-DE"/>
-        </w:rPr>
-        <w:t xml:space="preserve">Bachelor </w:t>
+      </w:pPr>
+      <w:r>
+        <w:t xml:space="preserve">“Benchmark für </w:t>
       </w:r>
       <w:proofErr w:type="spellStart"/>
       <w:r>
-        <w:rPr>
-          <w:lang w:val="de-DE"/>
-        </w:rPr>
-        <w:t>thesis</w:t>
+        <w:t>adiabatische</w:t>
       </w:r>
       <w:proofErr w:type="spellEnd"/>
-      <w:proofErr w:type="gramEnd"/>
-      <w:r>
-        <w:rPr>
-          <w:lang w:val="de-DE"/>
-        </w:rPr>
-        <w:t>)</w:t>
+      <w:r>
+        <w:t xml:space="preserve"> </w:t>
+      </w:r>
+      <w:proofErr w:type="spellStart"/>
+      <w:r>
+        <w:t>Ionisierungspotentiale</w:t>
+      </w:r>
+      <w:proofErr w:type="spellEnd"/>
+      <w:r>
+        <w:t>”, 2026 (Bachelor thesis)</w:t>
       </w:r>
     </w:p>
     <w:p>
@@ -900,7 +1063,12 @@
       </w:r>
       <w:r>
         <w:br/>
-        <w:t>Johannes-Gutenberg University Mainz, Mainz, Germany</w:t>
+      </w:r>
+      <w:r>
+        <w:t>Johannes Gutenberg</w:t>
+      </w:r>
+      <w:r>
+        <w:t xml:space="preserve"> University Mainz, Mainz, Germany</w:t>
       </w:r>
     </w:p>
     <w:p>
@@ -916,7 +1084,12 @@
       </w:r>
       <w:r>
         <w:br/>
-        <w:t>Johannes-Gutenberg University Mainz, Mainz, Germany</w:t>
+      </w:r>
+      <w:r>
+        <w:t>Johannes Gutenberg</w:t>
+      </w:r>
+      <w:r>
+        <w:t xml:space="preserve"> University Mainz, Mainz, Germany</w:t>
       </w:r>
     </w:p>
     <w:p>
@@ -970,43 +1143,33 @@
           <w:ilvl w:val="1"/>
           <w:numId w:val="10"/>
         </w:numPr>
-        <w:rPr>
-          <w:lang w:val="de-DE"/>
-        </w:rPr>
-      </w:pPr>
-      <w:r>
-        <w:rPr>
-          <w:lang w:val="de-DE"/>
-        </w:rPr>
-        <w:t>“Anregungen von Ethen und Ethin im magnetischen Feld”, 2020 (</w:t>
+      </w:pPr>
+      <w:r>
+        <w:t>“</w:t>
       </w:r>
       <w:proofErr w:type="spellStart"/>
       <w:r>
-        <w:rPr>
-          <w:lang w:val="de-DE"/>
-        </w:rPr>
-        <w:t>research</w:t>
+        <w:t>Anregungen</w:t>
       </w:r>
       <w:proofErr w:type="spellEnd"/>
       <w:r>
-        <w:rPr>
-          <w:lang w:val="de-DE"/>
-        </w:rPr>
+        <w:t xml:space="preserve"> von Ethen und Ethin </w:t>
+      </w:r>
+      <w:proofErr w:type="spellStart"/>
+      <w:r>
+        <w:t>im</w:t>
+      </w:r>
+      <w:proofErr w:type="spellEnd"/>
+      <w:r>
         <w:t xml:space="preserve"> </w:t>
       </w:r>
       <w:proofErr w:type="spellStart"/>
       <w:r>
-        <w:rPr>
-          <w:lang w:val="de-DE"/>
-        </w:rPr>
-        <w:t>project</w:t>
+        <w:t>magnetischen</w:t>
       </w:r>
       <w:proofErr w:type="spellEnd"/>
       <w:r>
-        <w:rPr>
-          <w:lang w:val="de-DE"/>
-        </w:rPr>
-        <w:t>)</w:t>
+        <w:t xml:space="preserve"> Feld”, 2020 (research project)</w:t>
       </w:r>
     </w:p>
     <w:p>
@@ -1053,11 +1216,6 @@
         <w:t>”, 2020 (Bachelor thesis)</w:t>
       </w:r>
     </w:p>
-    <w:p>
-      <w:pPr>
-        <w:pStyle w:val="Heading1"/>
-      </w:pPr>
-    </w:p>
     <w:p/>
     <w:p/>
     <w:p>
@@ -1318,43 +1476,31 @@
           <w:ilvl w:val="0"/>
           <w:numId w:val="9"/>
         </w:numPr>
+      </w:pPr>
+      <w:r>
         <w:rPr>
           <w:lang w:val="de-DE"/>
         </w:rPr>
-      </w:pPr>
-      <w:r>
-        <w:rPr>
-          <w:lang w:val="de-DE"/>
-        </w:rPr>
-        <w:t xml:space="preserve">2016 | Deutscher Akademischer Austauschdienst (DAAD) Scholarship - Master Studies </w:t>
+        <w:t xml:space="preserve">2016 </w:t>
+      </w:r>
+      <w:r>
+        <w:t xml:space="preserve">| Deutscher </w:t>
       </w:r>
       <w:proofErr w:type="spellStart"/>
       <w:r>
-        <w:rPr>
-          <w:lang w:val="de-DE"/>
-        </w:rPr>
-        <w:t>for</w:t>
+        <w:t>Akademischer</w:t>
       </w:r>
       <w:proofErr w:type="spellEnd"/>
       <w:r>
-        <w:rPr>
-          <w:lang w:val="de-DE"/>
-        </w:rPr>
-        <w:t xml:space="preserve"> All Academic </w:t>
+        <w:t xml:space="preserve"> </w:t>
       </w:r>
       <w:proofErr w:type="spellStart"/>
       <w:r>
-        <w:rPr>
-          <w:lang w:val="de-DE"/>
-        </w:rPr>
-        <w:t>Disciplines</w:t>
+        <w:t>Austauschdienst</w:t>
       </w:r>
       <w:proofErr w:type="spellEnd"/>
       <w:r>
-        <w:rPr>
-          <w:lang w:val="de-DE"/>
-        </w:rPr>
-        <w:t>, 2016/17</w:t>
+        <w:t xml:space="preserve"> (DAAD) Scholarship - Master Studies for All Academic Disciplines, 2016/17</w:t>
       </w:r>
     </w:p>
     <w:p>
@@ -1366,7 +1512,10 @@
         </w:numPr>
       </w:pPr>
       <w:r>
-        <w:t xml:space="preserve">2011 | State Scholarships Greece (IKY), Monetary award for the highest entry grade in the bachelor program of the chemistry department </w:t>
+        <w:t>2011 | State Scholarships Greece (IKY), Monetary award for the highest entry grade in the bachelor program of the chemistry</w:t>
+      </w:r>
+      <w:r>
+        <w:t xml:space="preserve"> department </w:t>
       </w:r>
     </w:p>
     <w:p>
@@ -1402,13 +1551,15 @@
       </w:r>
     </w:p>
     <w:p/>
-    <w:p/>
     <w:p>
       <w:pPr>
         <w:pStyle w:val="Heading1"/>
       </w:pPr>
       <w:r>
         <w:lastRenderedPageBreak/>
+        <w:t xml:space="preserve">Developer in </w:t>
+      </w:r>
+      <w:r>
         <w:t>Quantum Chemical Programs</w:t>
       </w:r>
     </w:p>
@@ -1516,7 +1667,19 @@
         <w:pStyle w:val="Heading1"/>
       </w:pPr>
       <w:r>
-        <w:t>Other skills and interests</w:t>
+        <w:t xml:space="preserve">Other </w:t>
+      </w:r>
+      <w:r>
+        <w:t>S</w:t>
+      </w:r>
+      <w:r>
+        <w:t xml:space="preserve">kills and </w:t>
+      </w:r>
+      <w:r>
+        <w:t>I</w:t>
+      </w:r>
+      <w:r>
+        <w:t>nterests</w:t>
       </w:r>
     </w:p>
     <w:p>
@@ -3591,7 +3754,6 @@
   <w:style w:type="character" w:default="1" w:styleId="DefaultParagraphFont">
     <w:name w:val="Default Paragraph Font"/>
     <w:uiPriority w:val="1"/>
-    <w:semiHidden/>
     <w:unhideWhenUsed/>
   </w:style>
   <w:style w:type="table" w:default="1" w:styleId="TableNormal">

</xml_diff>